<commit_message>
espec. trab. 1 de pc2
</commit_message>
<xml_diff>
--- a/aulas/poo/backes/Trab1-PC2.docx
+++ b/aulas/poo/backes/Trab1-PC2.docx
@@ -181,7 +181,25 @@
           <w:szCs w:val="24"/>
           <w:rtl w:val="0"/>
         </w:rPr>
-        <w:t xml:space="preserve">Padrões de projeto (do inglês, design pattern) são inspirados em uma ideia proposta por Christopher Alexander, um arquiteto — de construções civis e não de software — e professor da Universidade de Berkeley. Em 1977, Alexander lançou um livro chamado A Patterns Language, no qual ele documenta diversos padrões para construção de cidades e prédios. Eles podem ser criacionais, estruturais ou comportamentais.</w:t>
+        <w:t xml:space="preserve">Padrões de projeto (do inglês, </w:t>
+      </w:r>
+      <w:r>
+        <w:rPr>
+          <w:i w:val="1"/>
+          <w:iCs w:val="1"/>
+          <w:sz w:val="24"/>
+          <w:szCs w:val="24"/>
+          <w:rtl w:val="0"/>
+        </w:rPr>
+        <w:t xml:space="preserve">design pattern</w:t>
+      </w:r>
+      <w:r>
+        <w:rPr>
+          <w:sz w:val="24"/>
+          <w:szCs w:val="24"/>
+          <w:rtl w:val="0"/>
+        </w:rPr>
+        <w:t xml:space="preserve">) são inspirados em uma ideia proposta por Christopher Alexander, um arquiteto — de construções civis e não de software — e professor da Universidade de Berkeley. Em 1977, Alexander lançou um livro chamado “A Patterns Language” [1], no qual ele documenta diversos padrões para construção de cidades e prédios.</w:t>
       </w:r>
     </w:p>
     <w:p>
@@ -199,7 +217,43 @@
           <w:szCs w:val="24"/>
           <w:rtl w:val="0"/>
         </w:rPr>
-        <w:t xml:space="preserve">O presente trabalho visa discutir em sala de aula alguns padrões de projeto amplamente conhecidos no livro da "Gangue dos Quatro" [1], liderados pelo cientista da computação suíço Erich Gamma. Para atingir este objetivo, a sala de aula será dividida em 8 grupos. Cada grupo deverá apresentar um design pattern. </w:t>
+        <w:t xml:space="preserve">O presente trabalho visa discutir em sala de aula alguns padrões de projeto amplamente conhecidos no livro da "Gangue dos Quatro" [2], liderados pelo cientista da computação suíço Erich Gamma. Segundo ele, os padrões de projeto podem ser categorizados em três tipos: criacionais, estruturais ou comportamentais.</w:t>
+      </w:r>
+    </w:p>
+    <w:p>
+      <w:pPr>
+        <w:ind w:firstLine="720"/>
+        <w:jc w:val="both"/>
+        <w:rPr>
+          <w:sz w:val="24"/>
+          <w:szCs w:val="24"/>
+        </w:rPr>
+      </w:pPr>
+      <w:r>
+        <w:rPr>
+          <w:sz w:val="24"/>
+          <w:szCs w:val="24"/>
+          <w:rtl w:val="0"/>
+        </w:rPr>
+        <w:t xml:space="preserve">Para atingir este objetivo, a sala de aula será dividida em 8 grupos. Cada grupo deverá apresentar um </w:t>
+      </w:r>
+      <w:r>
+        <w:rPr>
+          <w:i w:val="1"/>
+          <w:iCs w:val="1"/>
+          <w:sz w:val="24"/>
+          <w:szCs w:val="24"/>
+          <w:rtl w:val="0"/>
+        </w:rPr>
+        <w:t xml:space="preserve">design pattern</w:t>
+      </w:r>
+      <w:r>
+        <w:rPr>
+          <w:sz w:val="24"/>
+          <w:szCs w:val="24"/>
+          <w:rtl w:val="0"/>
+        </w:rPr>
+        <w:t xml:space="preserve">. </w:t>
       </w:r>
     </w:p>
     <w:p>
@@ -379,14 +433,23 @@
         <w:ind w:left="0" w:firstLine="0"/>
         <w:jc w:val="both"/>
         <w:rPr>
+          <w:sz w:val="24"/>
+          <w:szCs w:val="24"/>
+          <w:u w:val="single"/>
+        </w:rPr>
+      </w:pPr>
+      <w:r>
+        <w:rPr>
           <w:b w:val="1"/>
           <w:bCs w:val="1"/>
           <w:i w:val="1"/>
           <w:iCs w:val="1"/>
           <w:sz w:val="24"/>
           <w:szCs w:val="24"/>
-        </w:rPr>
-      </w:pPr>
+          <w:rtl w:val="0"/>
+        </w:rPr>
+        <w:t xml:space="preserve">* </w:t>
+      </w:r>
       <w:r>
         <w:rPr>
           <w:b w:val="1"/>
@@ -395,9 +458,10 @@
           <w:iCs w:val="1"/>
           <w:sz w:val="24"/>
           <w:szCs w:val="24"/>
-          <w:rtl w:val="0"/>
-        </w:rPr>
-        <w:t xml:space="preserve">* </w:t>
+          <w:u w:val="single"/>
+          <w:rtl w:val="0"/>
+        </w:rPr>
+        <w:t xml:space="preserve">OBS.:</w:t>
       </w:r>
       <w:r>
         <w:rPr>
@@ -407,39 +471,31 @@
           <w:iCs w:val="1"/>
           <w:sz w:val="24"/>
           <w:szCs w:val="24"/>
+          <w:rtl w:val="0"/>
+        </w:rPr>
+        <w:t xml:space="preserve"> Todos os trabalhos deverão ser enviados para o SIGAA. O grupo deverá colocar os slides da apresentação (arquivo PowerPoint).</w:t>
+      </w:r>
+      <w:r>
+        <w:rPr>
+          <w:rtl w:val="0"/>
+        </w:rPr>
+      </w:r>
+    </w:p>
+    <w:p>
+      <w:pPr>
+        <w:ind w:left="0" w:firstLine="0"/>
+        <w:jc w:val="both"/>
+        <w:rPr>
+          <w:sz w:val="24"/>
+          <w:szCs w:val="24"/>
           <w:u w:val="single"/>
-          <w:rtl w:val="0"/>
-        </w:rPr>
-        <w:t xml:space="preserve">OBS.:</w:t>
-      </w:r>
-      <w:r>
-        <w:rPr>
-          <w:b w:val="1"/>
-          <w:bCs w:val="1"/>
-          <w:i w:val="1"/>
-          <w:iCs w:val="1"/>
-          <w:sz w:val="24"/>
-          <w:szCs w:val="24"/>
-          <w:rtl w:val="0"/>
-        </w:rPr>
-        <w:t xml:space="preserve"> Todos os trabalhos deverão ser enviados para o SIGAA. O grupo deverá colocar os slides da apresentação (arquivo PowerPoint), bem como a informação de todos os integrantes do grupo (nome completo e matrícula).</w:t>
-      </w:r>
-    </w:p>
-    <w:p>
-      <w:pPr>
-        <w:ind w:left="0" w:firstLine="0"/>
-        <w:jc w:val="both"/>
+        </w:rPr>
+      </w:pPr>
+      <w:r>
         <w:rPr>
           <w:sz w:val="24"/>
           <w:szCs w:val="24"/>
           <w:u w:val="single"/>
-        </w:rPr>
-      </w:pPr>
-      <w:r>
-        <w:rPr>
-          <w:sz w:val="24"/>
-          <w:szCs w:val="24"/>
-          <w:u w:val="single"/>
           <w:rtl w:val="0"/>
         </w:rPr>
         <w:t xml:space="preserve">Bibliografia:</w:t>
@@ -473,7 +529,38 @@
           <w:szCs w:val="24"/>
           <w:rtl w:val="0"/>
         </w:rPr>
-        <w:t xml:space="preserve">[1] Erich Gamma, Richard Helm, Ralph Johnson, John Vlissides. "Design Patterns: Elements of Reusable Object-Oriented Software". Addison-Wesley, 1995.</w:t>
+        <w:t xml:space="preserve">[1] Alexander, C., Ishikawa, S., &amp; Silverstein, M. (1977). A Pattern Language: Towns, Buildings, Construction. Oxford University Press.</w:t>
+      </w:r>
+    </w:p>
+    <w:p>
+      <w:pPr>
+        <w:jc w:val="both"/>
+        <w:rPr>
+          <w:sz w:val="24"/>
+          <w:szCs w:val="24"/>
+        </w:rPr>
+      </w:pPr>
+      <w:r>
+        <w:rPr>
+          <w:sz w:val="24"/>
+          <w:szCs w:val="24"/>
+          <w:rtl w:val="0"/>
+        </w:rPr>
+        <w:t xml:space="preserve">[2] Erich Gamma, Richard Helm, Ralph Johnson, John Vlissides. "Design Patterns: Elements of Reusable Object-Oriented Software". Addison-Wesley, 1995.</w:t>
+      </w:r>
+    </w:p>
+    <w:p>
+      <w:pPr>
+        <w:jc w:val="both"/>
+        <w:rPr>
+          <w:sz w:val="24"/>
+          <w:szCs w:val="24"/>
+        </w:rPr>
+      </w:pPr>
+      <w:r>
+        <w:rPr>
+          <w:rtl w:val="0"/>
+        </w:rPr>
       </w:r>
     </w:p>
     <w:p>

</xml_diff>